<commit_message>
regenerate SMMR v1 submission package after narrative fixes
Co-Authored-By: Tatsuki Onishi <bougtoir@gmail.com>
</commit_message>
<xml_diff>
--- a/results/manuscript/smmr_submission/IONE_smmr_v1.docx
+++ b/results/manuscript/smmr_submission/IONE_smmr_v1.docx
@@ -74,7 +74,7 @@
         </m:sSub>
       </m:oMath>
       <w:r>
-        <w:t xml:space="preserve"> discriminated the alternative from the empirical null only at chance level (C1 AUC 0.460-0.545; W AUC 0.427-0.561; TPR up to 0.060 at 5% FPR). The best method reduced random-effects ATE bias by more than half (from 0.01865 to 0.00816; relative reduction 0.563). Bias reduction improved with larger samples and stronger effect modification, while null-centred W confirmed weak discrimination.</w:t>
+        <w:t xml:space="preserve"> discriminated the alternative from the empirical null only at chance level (C1 AUC 0.460-0.545; W AUC 0.427-0.561; TPR up to 0.060 at 5% FPR). The best method reduced random-effects ATE bias by more than half (from 0.01865 to 0.00816; relative reduction 0.563). Relative bias reduction improved as the Z-to-Y effect strengthened, while sample-size gains were method-specific; null-centred W confirmed weak discrimination.</w:t>
       </w:r>
     </w:p>
     <w:p>
@@ -970,7 +970,7 @@
     </w:p>
     <w:p>
       <w:r>
-        <w:t xml:space="preserve">Table 1 reports the primary scenario (n=2000, 10 studies, K=5). Agreement with the constructed true-Z partition was modest (Oracle ARI 0.372; best non-Oracle 1B_residual 0.032). Methods closer to the Oracle had C1 nearer to 1 and higher </w:t>
+        <w:t xml:space="preserve">Table 1 reports the primary scenario (n=2000, 10 studies, K=5). Agreement with the constructed true-Z partition was modest (Oracle ARI 0.372; best non-Oracle 1B_residual 0.032). Oracle and residual methods had the highest </w:t>
       </w:r>
       <m:oMath>
         <m:sSub>
@@ -987,7 +987,24 @@
         </m:sSub>
       </m:oMath>
       <w:r>
-        <w:t xml:space="preserve">, while random stratification yielded C1 0.883; </w:t>
+        <w:t xml:space="preserve"> values, but C1 was high across most methods (even random stratification yielded C1 0.883), indicating that C1 alone did not separate useful from chance stratifications; </w:t>
+      </w:r>
+      <m:oMath>
+        <m:sSub>
+          <m:e>
+            <m:r>
+              <m:t xml:space="preserve">W</m:t>
+            </m:r>
+          </m:e>
+          <m:sub>
+            <m:r>
+              <m:t xml:space="preserve">true</m:t>
+            </m:r>
+          </m:sub>
+        </m:sSub>
+      </m:oMath>
+      <w:r>
+        <w:t xml:space="preserve"> separated the methods better. </w:t>
       </w:r>
       <m:oMath>
         <m:sSub>
@@ -3196,7 +3213,7 @@
     </w:p>
     <w:p>
       <w:r>
-        <w:t>Figure 4 and Supplementary Table S2 report n = 500, 2000 and 10 000 (K=5). Crude bias declined with n; the largest relative reductions for leading methods occurred at n = 10 000. At n = 10 000 the residual method had random-effects ATE bias 0.00864 (relative reduction 0.348), compared with 0.00816 at n = 2000. The residual method showed an absolute floor near 0.008-0.009, so its relative reduction decreased with n. This pattern indicates that stratification can remove the estimable part of confounding-driven aggregation bias, but it cannot fully adjust for unmodelled hidden effect modification.</w:t>
+        <w:t>Figure 4 and Supplementary Table S2 report n = 500, 2000 and 10 000 (K=5). Crude bias declined with n. The residual method's absolute random-effects ATE bias plateaued near 0.008–0.009 across the three sample sizes (0.00824 at n=500, 0.00852 at n=2000 and 0.00864 at n=10 000), so its relative reduction fell as the crude marginal estimate became more precise. Propensity-score, prognostic-score and clustering-based methods achieved larger relative reductions at n=10 000 (range 0.533–0.669), confirming that performance depends on the method as well as sample size. This pattern indicates that stratification can remove the estimable part of confounding-driven aggregation bias, but it cannot fully adjust for unmodelled hidden effect modification.</w:t>
       </w:r>
     </w:p>
     <w:p>
@@ -5315,7 +5332,7 @@
     </w:p>
     <w:p>
       <w:r>
-        <w:t>At n = 10 000 the residual method still showed a non-negligible random-effects ATE bias (0.00864; relative reduction 0.348), although the absolute bias fell compared with n = 2000. This floor is consistent with the ARI ceiling: once finite-sample error is removed, remaining bias reflects the structural mismatch between the discovered strata and the true CATE surface. The true-CATE-quantile oracle provides an upper bound on what perfect sorting could achieve; the gap between the oracle and the leading data-driven method quantifies the cost of not observing the true effect modifier.</w:t>
+        <w:t>At n = 10 000 the residual method still showed a non-negligible random-effects ATE bias (0.00864; relative reduction 0.348), similar to the absolute floor observed at n=500 (0.00824) and n=2000 (0.00852). This floor is consistent with the ARI ceiling: once finite-sample error is removed, remaining bias reflects the structural mismatch between the discovered strata and the true CATE surface. The true-CATE-quantile oracle provides an upper bound on what perfect sorting could achieve; the gap between the oracle and the leading data-driven method quantifies the cost of not observing the true effect modifier.</w:t>
       </w:r>
     </w:p>
     <w:p>

</xml_diff>

<commit_message>
regenerate SMMR v1 package with C1 ROC directional caveat
Co-Authored-By: Tatsuki Onishi <bougtoir@gmail.com>
</commit_message>
<xml_diff>
--- a/results/manuscript/smmr_submission/IONE_smmr_v1.docx
+++ b/results/manuscript/smmr_submission/IONE_smmr_v1.docx
@@ -786,7 +786,7 @@
         </m:sSub>
       </m:oMath>
       <w:r>
-        <w:t xml:space="preserve"> above its null 95th percentile). Because the null distribution preserves confounding and covariate traces but removes true effect modification, these metrics quantify how well the diagnostics distinguish absence from presence of the simulated modification. AUC near 0.5 and low TPR indicate that the diagnostics do not provide reliable classification on their own in the primary scenario.</w:t>
+        <w:t xml:space="preserve"> above its null 95th percentile). Because the null distribution preserves confounding and covariate traces but removes true effect modification, these metrics quantify how well the diagnostics distinguish absence from presence of the simulated modification. AUC near 0.5 and low TPR indicate that the diagnostics do not provide reliable classification on their own in the primary scenario; for some methods C1 AUC fell below 0.5, indicating that the alternative DGM shifted C1 in the opposite direction to the lower-tail hypothesis, so the one-sided threshold is not universally valid.</w:t>
       </w:r>
     </w:p>
     <w:p>
@@ -4039,7 +4039,7 @@
         </m:sSub>
       </m:oMath>
       <w:r>
-        <w:t xml:space="preserve"> TPR 0.020–0.080. These values show that the diagnostics did not reliably distinguish the alternative DGM from the null in the primary scenario. A main-effects-only outcome model for </w:t>
+        <w:t xml:space="preserve"> TPR 0.020–0.080. These values show that the diagnostics did not reliably distinguish the alternative DGM from the null in the primary scenario; the C1 AUCs at or below 0.5 for several methods confirm that the lower-tail null threshold does not match the direction of the alternative DGM shift for those methods. A main-effects-only outcome model for </w:t>
       </w:r>
       <m:oMath>
         <m:sSub>

</xml_diff>

<commit_message>
style: SAGE Vancouver in-text superscript numerals with comma separators and numbered reference list
Co-Authored-By: Tatsuki Onishi <bougtoir@gmail.com>
</commit_message>
<xml_diff>
--- a/results/manuscript/smmr_submission/IONE_smmr_v1.docx
+++ b/results/manuscript/smmr_submission/IONE_smmr_v1.docx
@@ -122,7 +122,7 @@
         <w:rPr>
           <w:vertAlign w:val="superscript"/>
         </w:rPr>
-        <w:t>[1]</w:t>
+        <w:t>1</w:t>
       </w:r>
       <w:r>
         <w:t xml:space="preserve">. IPD meta-analysis preserves participant-level covariates and can increase power for treatment-covariate interactions </w:t>
@@ -131,14 +131,14 @@
         <w:rPr>
           <w:vertAlign w:val="superscript"/>
         </w:rPr>
-        <w:t>[2]</w:t>
+        <w:t>2</w:t>
       </w:r>
       <w:r/>
       <w:r>
         <w:rPr>
           <w:vertAlign w:val="superscript"/>
         </w:rPr>
-        <w:t>[3]</w:t>
+        <w:t>3</w:t>
       </w:r>
       <w:r>
         <w:t xml:space="preserve">. Random-effects syntheses are recommended when between-study heterogeneity is suspected </w:t>
@@ -147,21 +147,21 @@
         <w:rPr>
           <w:vertAlign w:val="superscript"/>
         </w:rPr>
-        <w:t>[4]</w:t>
+        <w:t>4</w:t>
       </w:r>
       <w:r/>
       <w:r>
         <w:rPr>
           <w:vertAlign w:val="superscript"/>
         </w:rPr>
-        <w:t>[5]</w:t>
+        <w:t>5</w:t>
       </w:r>
       <w:r/>
       <w:r>
         <w:rPr>
           <w:vertAlign w:val="superscript"/>
         </w:rPr>
-        <w:t>[6]</w:t>
+        <w:t>6</w:t>
       </w:r>
       <w:r>
         <w:t xml:space="preserve">, yet conventional summaries estimate a marginal effect and may mislead when effect modifiers are unmeasured or omitted </w:t>
@@ -170,14 +170,14 @@
         <w:rPr>
           <w:vertAlign w:val="superscript"/>
         </w:rPr>
-        <w:t>[7]</w:t>
+        <w:t>7</w:t>
       </w:r>
       <w:r/>
       <w:r>
         <w:rPr>
           <w:vertAlign w:val="superscript"/>
         </w:rPr>
-        <w:t>[8]</w:t>
+        <w:t>8</w:t>
       </w:r>
       <w:r>
         <w:t xml:space="preserve">. When the pooled population contains subgroups with different treatment effects, the marginal effect can reverse within population strata, producing Simpson-type paradoxes </w:t>
@@ -186,14 +186,14 @@
         <w:rPr>
           <w:vertAlign w:val="superscript"/>
         </w:rPr>
-        <w:t>[9]</w:t>
+        <w:t>9</w:t>
       </w:r>
       <w:r/>
       <w:r>
         <w:rPr>
           <w:vertAlign w:val="superscript"/>
         </w:rPr>
-        <w:t>[10]</w:t>
+        <w:t>10</w:t>
       </w:r>
       <w:r>
         <w:t>.</w:t>
@@ -212,7 +212,7 @@
         <w:rPr>
           <w:vertAlign w:val="superscript"/>
         </w:rPr>
-        <w:t>[11]</w:t>
+        <w:t>11</w:t>
       </w:r>
       <w:r>
         <w:t xml:space="preserve">, university admissions </w:t>
@@ -221,7 +221,7 @@
         <w:rPr>
           <w:vertAlign w:val="superscript"/>
         </w:rPr>
-        <w:t>[12]</w:t>
+        <w:t>12</w:t>
       </w:r>
       <w:r>
         <w:t xml:space="preserve">, COVID-19 case-fatality comparisons </w:t>
@@ -230,7 +230,7 @@
         <w:rPr>
           <w:vertAlign w:val="superscript"/>
         </w:rPr>
-        <w:t>[13]</w:t>
+        <w:t>13</w:t>
       </w:r>
       <w:r>
         <w:t xml:space="preserve">, national vaccine-surveillance data </w:t>
@@ -239,7 +239,7 @@
         <w:rPr>
           <w:vertAlign w:val="superscript"/>
         </w:rPr>
-        <w:t>[14]</w:t>
+        <w:t>14</w:t>
       </w:r>
       <w:r>
         <w:t xml:space="preserve">, and smoking-mortality studies </w:t>
@@ -248,7 +248,7 @@
         <w:rPr>
           <w:vertAlign w:val="superscript"/>
         </w:rPr>
-        <w:t>[15]</w:t>
+        <w:t>15</w:t>
       </w:r>
       <w:r>
         <w:t xml:space="preserve">. Established methods adjust for measured confounders but do not detect unmeasured population structure. We operationalise IONE through two coherence diagnostics: C1, derived from the </w:t>
@@ -274,7 +274,7 @@
         <w:rPr>
           <w:vertAlign w:val="superscript"/>
         </w:rPr>
-        <w:t>[5]</w:t>
+        <w:t>5</w:t>
       </w:r>
       <w:r>
         <w:t xml:space="preserve"> applied to stratum-specific log odds ratios, and W, the proportion of total CATE variance explained by the stratification. Stratum-specific risk differences are synthesised with fixed-effect or DerSimonian-Laird random-effects meta-analysis. C1 measures the coherence of a stratification after it has been formed; W is a ratio whose denominator is the overall CATE variance and is therefore unstable when the modification signal is weak.</w:t>
@@ -296,7 +296,7 @@
         <w:rPr>
           <w:vertAlign w:val="superscript"/>
         </w:rPr>
-        <w:t>[16]</w:t>
+        <w:t>16</w:t>
       </w:r>
       <w:r>
         <w:t>.</w:t>
@@ -397,7 +397,7 @@
         <w:rPr>
           <w:vertAlign w:val="superscript"/>
         </w:rPr>
-        <w:t>[17]</w:t>
+        <w:t>17</w:t>
       </w:r>
       <w:r>
         <w:t xml:space="preserve">, Gaussian mixture model on X </w:t>
@@ -406,7 +406,7 @@
         <w:rPr>
           <w:vertAlign w:val="superscript"/>
         </w:rPr>
-        <w:t>[18]</w:t>
+        <w:t>18</w:t>
       </w:r>
       <w:r>
         <w:t xml:space="preserve">, prognostic-score stratification (untreated-only Y~X) </w:t>
@@ -415,7 +415,7 @@
         <w:rPr>
           <w:vertAlign w:val="superscript"/>
         </w:rPr>
-        <w:t>[19]</w:t>
+        <w:t>19</w:t>
       </w:r>
       <w:r>
         <w:t>; Oracle baselines stratify by true Z-space; random assignment provides a chance reference. Equal-frequency strata were used throughout, logistic regression used l2 regularisation (C=1.0, lbfgs), and outcome-informed methods used a 50/50 discovery/evaluation split.</w:t>
@@ -437,7 +437,7 @@
         <w:rPr>
           <w:vertAlign w:val="superscript"/>
         </w:rPr>
-        <w:t>[4]</w:t>
+        <w:t>4</w:t>
       </w:r>
       <w:r>
         <w:t xml:space="preserve">. </w:t>
@@ -510,7 +510,7 @@
         <w:rPr>
           <w:vertAlign w:val="superscript"/>
         </w:rPr>
-        <w:t>[20]</w:t>
+        <w:t>20</w:t>
       </w:r>
       <w:r>
         <w:t>: agreement between estimated strata and a constructed true-Z reference partition, corrected for chance. The true-Z partition is a k-means clustering of standardised Z-space with K strata, so ARI measures agreement with an operational reference rather than clinical validity.</w:t>
@@ -548,7 +548,7 @@
         <w:rPr>
           <w:vertAlign w:val="superscript"/>
         </w:rPr>
-        <w:t>[5]</w:t>
+        <w:t>5</w:t>
       </w:r>
       <w:r>
         <w:t>. Lower C1 indicates greater between-stratum heterogeneity of stratum-specific log odds ratios. Because C1 is computed on the log-odds scale while ATE bias is on the risk-difference scale, it is an indirect diagnostic of bias; it summarises the coherence of the selected partition, not the magnitude of hidden modification.</w:t>
@@ -818,35 +818,35 @@
         <w:rPr>
           <w:vertAlign w:val="superscript"/>
         </w:rPr>
-        <w:t>[11]</w:t>
+        <w:t>11</w:t>
       </w:r>
       <w:r/>
       <w:r>
         <w:rPr>
           <w:vertAlign w:val="superscript"/>
         </w:rPr>
-        <w:t>[12]</w:t>
+        <w:t>12</w:t>
       </w:r>
       <w:r/>
       <w:r>
         <w:rPr>
           <w:vertAlign w:val="superscript"/>
         </w:rPr>
-        <w:t>[13]</w:t>
+        <w:t>13</w:t>
       </w:r>
       <w:r/>
       <w:r>
         <w:rPr>
           <w:vertAlign w:val="superscript"/>
         </w:rPr>
-        <w:t>[14]</w:t>
+        <w:t>14</w:t>
       </w:r>
       <w:r/>
       <w:r>
         <w:rPr>
           <w:vertAlign w:val="superscript"/>
         </w:rPr>
-        <w:t>[15]</w:t>
+        <w:t>15</w:t>
       </w:r>
       <w:r>
         <w:t xml:space="preserve">. The Israeli vaccination example used pseudo-IPD reconstructed from age- and vaccination-stratified COVID-19-related hospitalisation counts published by Haas et al. </w:t>
@@ -855,7 +855,7 @@
         <w:rPr>
           <w:vertAlign w:val="superscript"/>
         </w:rPr>
-        <w:t>[14]</w:t>
+        <w:t>14</w:t>
       </w:r>
       <w:r>
         <w:t xml:space="preserve">. We chose hospitalisation rather than infection counts because the published Table 2 provides age- and vaccination-stratified counts for a severe endpoint where age confounding is pronounced, and because the low event rate (~0.09% in the down-sampled data) creates a stress-test for rare outcomes. Because the published counts cover approximately 6.5 million people, we used a stratified random down-sample of 100,000 records preserving the age- and vaccination-specific hospitalisation rates. In the down-sampled pseudo-IPD, some cells contained very few or zero hospitalisation events; logistic models used for outcome-informed methods were fitted with L2 regularisation, and any degenerate one-class fit was handled by returning the observed mean probability. Pseudo-general variables mimicked proxies of the known confounder and the number of strata K was selected from the set {2, 3, min(</w:t>
@@ -928,7 +928,7 @@
         <w:rPr>
           <w:vertAlign w:val="superscript"/>
         </w:rPr>
-        <w:t>[16]</w:t>
+        <w:t>16</w:t>
       </w:r>
       <w:r>
         <w:t xml:space="preserve">; checklists are in Additional files 2 and 3. The pipeline is version-controlled and every manuscript number is read from repository CSV outputs. Simulations used Python 3.11; the exact dependency versions are in </w:t>
@@ -2622,35 +2622,35 @@
         <w:rPr>
           <w:vertAlign w:val="superscript"/>
         </w:rPr>
-        <w:t>[11]</w:t>
+        <w:t>11</w:t>
       </w:r>
       <w:r/>
       <w:r>
         <w:rPr>
           <w:vertAlign w:val="superscript"/>
         </w:rPr>
-        <w:t>[12]</w:t>
+        <w:t>12</w:t>
       </w:r>
       <w:r/>
       <w:r>
         <w:rPr>
           <w:vertAlign w:val="superscript"/>
         </w:rPr>
-        <w:t>[13]</w:t>
+        <w:t>13</w:t>
       </w:r>
       <w:r/>
       <w:r>
         <w:rPr>
           <w:vertAlign w:val="superscript"/>
         </w:rPr>
-        <w:t>[14]</w:t>
+        <w:t>14</w:t>
       </w:r>
       <w:r/>
       <w:r>
         <w:rPr>
           <w:vertAlign w:val="superscript"/>
         </w:rPr>
-        <w:t>[15]</w:t>
+        <w:t>15</w:t>
       </w:r>
       <w:r>
         <w:t>. Table 2 reports the best non-Oracle method per dataset. The Israel hospitalisation example was the most challenging: strong age confounding and a very low hospitalisation rate (~0.09%) meant that the crude marginal association reversed after stratification, yet separating the data into the known age strata remained difficult. The low event rate also produced occasional near-zero or zero-event cells, which illustrates the limits of outcome-informed stratification for rare outcomes.</w:t>
@@ -5200,7 +5200,7 @@
         <w:rPr>
           <w:vertAlign w:val="superscript"/>
         </w:rPr>
-        <w:t>[17]</w:t>
+        <w:t>17</w:t>
       </w:r>
       <w:r>
         <w:t xml:space="preserve"> and prognostic-score </w:t>
@@ -5209,7 +5209,7 @@
         <w:rPr>
           <w:vertAlign w:val="superscript"/>
         </w:rPr>
-        <w:t>[19]</w:t>
+        <w:t>19</w:t>
       </w:r>
       <w:r>
         <w:t xml:space="preserve"> methods adjust for measured confounders but do not detect unmeasured population structure. Latent-class models </w:t>
@@ -5218,7 +5218,7 @@
         <w:rPr>
           <w:vertAlign w:val="superscript"/>
         </w:rPr>
-        <w:t>[18]</w:t>
+        <w:t>18</w:t>
       </w:r>
       <w:r>
         <w:t xml:space="preserve"> seek hidden subgroups but need strong assumptions and do not report a transparent between-stratum heterogeneity diagnostic such as C1. IONE adds a pair of descriptive diagnostics that can be reported alongside these methods.</w:t>
@@ -5405,7 +5405,7 @@
         <w:rPr>
           <w:vertAlign w:val="superscript"/>
         </w:rPr>
-        <w:t>[16]</w:t>
+        <w:t>16</w:t>
       </w:r>
       <w:r>
         <w:t>, reported the data-generating mechanism and estimands transparently, and generated all numerical results from version-controlled repository scripts.</w:t>
@@ -5599,35 +5599,35 @@
         <w:rPr>
           <w:vertAlign w:val="superscript"/>
         </w:rPr>
-        <w:t>[11]</w:t>
+        <w:t>11</w:t>
       </w:r>
       <w:r/>
       <w:r>
         <w:rPr>
           <w:vertAlign w:val="superscript"/>
         </w:rPr>
-        <w:t>[12]</w:t>
+        <w:t>12</w:t>
       </w:r>
       <w:r/>
       <w:r>
         <w:rPr>
           <w:vertAlign w:val="superscript"/>
         </w:rPr>
-        <w:t>[13]</w:t>
+        <w:t>13</w:t>
       </w:r>
       <w:r/>
       <w:r>
         <w:rPr>
           <w:vertAlign w:val="superscript"/>
         </w:rPr>
-        <w:t>[14]</w:t>
+        <w:t>14</w:t>
       </w:r>
       <w:r/>
       <w:r>
         <w:rPr>
           <w:vertAlign w:val="superscript"/>
         </w:rPr>
-        <w:t>[15]</w:t>
+        <w:t>15</w:t>
       </w:r>
       <w:r>
         <w:t>.</w:t>
@@ -5752,102 +5752,102 @@
     </w:p>
     <w:p>
       <w:r>
-        <w:t>[1] Borenstein M, Hedges LV, Higgins JPT, Rothstein HR. Introduction to Meta-Analysis. Chichester: John Wiley &amp; Sons; 2009.</w:t>
+        <w:t>1. Borenstein M, Hedges LV, Higgins JPT, Rothstein HR. Introduction to Meta-Analysis. Chichester: John Wiley &amp; Sons; 2009.</w:t>
       </w:r>
     </w:p>
     <w:p>
       <w:r>
-        <w:t>[2] Riley RD, Lambert PC, Abo-Zaid G. Meta-analysis of individual participant data: rationale, conduct, and reporting. BMJ. 2010;340:c221.</w:t>
+        <w:t>2. Riley RD, Lambert PC, Abo-Zaid G. Meta-analysis of individual participant data: rationale, conduct, and reporting. BMJ. 2010;340:c221.</w:t>
       </w:r>
     </w:p>
     <w:p>
       <w:r>
-        <w:t>[3] Simmonds MC, Higgins JPT, Stewart LA, Tierney JF, Clarke MJ, Thompson SG. Meta-analysis of individual patient data from randomized trials: a review of methods used in practice. Clin Trials. 2005;2(3):209–217.</w:t>
+        <w:t>3. Simmonds MC, Higgins JPT, Stewart LA, Tierney JF, Clarke MJ, Thompson SG. Meta-analysis of individual patient data from randomized trials: a review of methods used in practice. Clin Trials. 2005;2(3):209–217.</w:t>
       </w:r>
     </w:p>
     <w:p>
       <w:r>
-        <w:t>[4] DerSimonian R, Laird N. Meta-analysis in clinical trials. Control Clin Trials. 1986;7(3):177–188.</w:t>
+        <w:t>4. DerSimonian R, Laird N. Meta-analysis in clinical trials. Control Clin Trials. 1986;7(3):177–188.</w:t>
       </w:r>
     </w:p>
     <w:p>
       <w:r>
-        <w:t>[5] Higgins JPT, Thompson SG. Quantifying heterogeneity in a meta-analysis. Stat Med. 2002;21(11):1539–1558.</w:t>
+        <w:t>5. Higgins JPT, Thompson SG. Quantifying heterogeneity in a meta-analysis. Stat Med. 2002;21(11):1539–1558.</w:t>
       </w:r>
     </w:p>
     <w:p>
       <w:r>
-        <w:t>[6] Riley RD, Higgins JPT, Deeks JJ. Interpretation of random effects meta-analyses. BMJ. 2011;342:d549.</w:t>
+        <w:t>6. Riley RD, Higgins JPT, Deeks JJ. Interpretation of random effects meta-analyses. BMJ. 2011;342:d549.</w:t>
       </w:r>
     </w:p>
     <w:p>
       <w:r>
-        <w:t>[7] Pearl J. Causality. 2nd ed. Cambridge: Cambridge University Press; 2009.</w:t>
+        <w:t>7. Pearl J. Causality. 2nd ed. Cambridge: Cambridge University Press; 2009.</w:t>
       </w:r>
     </w:p>
     <w:p>
       <w:r>
-        <w:t>[8] Greenland S, Robins JM, Pearl J. Confounding and collapsibility in causal inference. Stat Sci. 1999;14(1):29–46.</w:t>
+        <w:t>8. Greenland S, Robins JM, Pearl J. Confounding and collapsibility in causal inference. Stat Sci. 1999;14(1):29–46.</w:t>
       </w:r>
     </w:p>
     <w:p>
       <w:r>
-        <w:t>[9] Simpson EH. The interpretation of interaction in contingency tables. J R Stat Soc Ser B. 1951;13(2):238–241.</w:t>
+        <w:t>9. Simpson EH. The interpretation of interaction in contingency tables. J R Stat Soc Ser B. 1951;13(2):238–241.</w:t>
       </w:r>
     </w:p>
     <w:p>
       <w:r>
-        <w:t>[10] Rojanaworarit C. Misleading epidemiological and statistical evidence in the presence of Simpson's paradox: an illustrative study using simulated scenarios. J Med Life. 2020;13(1):37–44.</w:t>
+        <w:t>10. Rojanaworarit C. Misleading epidemiological and statistical evidence in the presence of Simpson's paradox: an illustrative study using simulated scenarios. J Med Life. 2020;13(1):37–44.</w:t>
       </w:r>
     </w:p>
     <w:p>
       <w:r>
-        <w:t>[11] Charig CR, Webb DR, Payne SR, Wickham JE. Comparison of treatment of renal calculi by open surgery, percutaneous nephrolithotomy, and extracorporeal shockwave lithotripsy. BMJ. 1986;292(6521):879–882.</w:t>
+        <w:t>11. Charig CR, Webb DR, Payne SR, Wickham JE. Comparison of treatment of renal calculi by open surgery, percutaneous nephrolithotomy, and extracorporeal shockwave lithotripsy. BMJ. 1986;292(6521):879–882.</w:t>
       </w:r>
     </w:p>
     <w:p>
       <w:r>
-        <w:t>[12] Bickel PJ, Hammel EA, O'Connell JW. Sex bias in graduate admissions: data from Berkeley. Science. 1975;187(4175):398–404.</w:t>
+        <w:t>12. Bickel PJ, Hammel EA, O'Connell JW. Sex bias in graduate admissions: data from Berkeley. Science. 1975;187(4175):398–404.</w:t>
       </w:r>
     </w:p>
     <w:p>
       <w:r>
-        <w:t>[13] von Kügelgen J, Gresele L, Schölkopf B. Simpson's paradox in Covid-19 case fatality rates: a mediation analysis of age-related causal effects. IEEE Trans Artif Intell. 2021;2(1):18–27.</w:t>
+        <w:t>13. von Kügelgen J, Gresele L, Schölkopf B. Simpson's paradox in Covid-19 case fatality rates: a mediation analysis of age-related causal effects. IEEE Trans Artif Intell. 2021;2(1):18–27.</w:t>
       </w:r>
     </w:p>
     <w:p>
       <w:r>
-        <w:t>[14] Haas EJ, Angulo FJ, McLaughlin JM, et al. Impact and effectiveness of mRNA BNT162b2 vaccine against SARS-CoV-2 infections and COVID-19 cases, hospitalisations, and deaths following a nationwide vaccination campaign in Israel: an observational study using national surveillance data. Lancet. 2021;397(10287):1819–1829.</w:t>
+        <w:t>14. Haas EJ, Angulo FJ, McLaughlin JM, et al. Impact and effectiveness of mRNA BNT162b2 vaccine against SARS-CoV-2 infections and COVID-19 cases, hospitalisations, and deaths following a nationwide vaccination campaign in Israel: an observational study using national surveillance data. Lancet. 2021;397(10287):1819–1829.</w:t>
       </w:r>
     </w:p>
     <w:p>
       <w:r>
-        <w:t>[15] Appleton DR, French NR, Vanderpump MP. Ignoring a covariate: an example of Simpson's paradox. Am Stat. 1996;50(4):340–341.</w:t>
+        <w:t>15. Appleton DR, French NR, Vanderpump MP. Ignoring a covariate: an example of Simpson's paradox. Am Stat. 1996;50(4):340–341.</w:t>
       </w:r>
     </w:p>
     <w:p>
       <w:r>
-        <w:t>[16] Morris TP, White IR, Crowther MJ. Using simulation studies to evaluate statistical methods. Stat Med. 2019;38(11):2074–2102.</w:t>
+        <w:t>16. Morris TP, White IR, Crowther MJ. Using simulation studies to evaluate statistical methods. Stat Med. 2019;38(11):2074–2102.</w:t>
       </w:r>
     </w:p>
     <w:p>
       <w:r>
-        <w:t>[17] Rosenbaum PR, Rubin DB. The central role of the propensity score in observational studies for causal effects. Biometrika. 1983;70(1):41–55.</w:t>
+        <w:t>17. Rosenbaum PR, Rubin DB. The central role of the propensity score in observational studies for causal effects. Biometrika. 1983;70(1):41–55.</w:t>
       </w:r>
     </w:p>
     <w:p>
       <w:r>
-        <w:t>[18] McLachlan GJ, Peel D. Finite Mixture Models. New York: Wiley; 2000.</w:t>
+        <w:t>18. McLachlan GJ, Peel D. Finite Mixture Models. New York: Wiley; 2000.</w:t>
       </w:r>
     </w:p>
     <w:p>
       <w:r>
-        <w:t>[19] Hansen BB. The prognostic analogue of the propensity score. Biometrika. 2008;95(2):481–488.</w:t>
+        <w:t>19. Hansen BB. The prognostic analogue of the propensity score. Biometrika. 2008;95(2):481–488.</w:t>
       </w:r>
     </w:p>
     <w:p>
       <w:r>
-        <w:t>[20] Hubert L, Arabie P. Comparing partitions. J Classif. 1985;2(1):193–218.</w:t>
+        <w:t>20. Hubert L, Arabie P. Comparing partitions. J Classif. 1985;2(1):193–218.</w:t>
       </w:r>
     </w:p>
     <w:sectPr>

</xml_diff>

<commit_message>
Apply SMMR v1 reviewer fixes: cover-letter placeholder, absolute-deviation S7, terminology, conclusion sharpening, table/figure ordering
Co-Authored-By: Tatsuki Onishi <bougtoir@gmail.com>
</commit_message>
<xml_diff>
--- a/results/manuscript/smmr_submission/IONE_smmr_v1.docx
+++ b/results/manuscript/smmr_submission/IONE_smmr_v1.docx
@@ -74,7 +74,7 @@
         </m:sSub>
       </m:oMath>
       <w:r>
-        <w:t xml:space="preserve"> discriminated the alternative from the empirical null only at chance level (C1 AUC 0.460-0.545; W AUC 0.427-0.561; TPR up to 0.060 at 5% FPR). The best method reduced random-effects ATE bias by more than half (from 0.01865 to 0.00816; relative reduction 0.563). Relative bias reduction improved as the Z-to-Y effect strengthened, while sample-size gains were method-specific; null-centred W confirmed weak discrimination.</w:t>
+        <w:t xml:space="preserve"> discriminated the alternative from the empirical null only at chance level (C1 AUC 0.460-0.545; W AUC 0.427-0.561; TPR up to 0.060 at 5% FPR). The best method reduced random-effects ATE bias by more than half (from 0.01865 to 0.00816; relative reduction 0.563). Relative bias reduction improved as the Z-to-Y effect strengthened, while sample-size gains were method-specific; W excess showed weak discrimination.</w:t>
       </w:r>
     </w:p>
     <w:p>
@@ -125,7 +125,7 @@
         <w:t>1</w:t>
       </w:r>
       <w:r>
-        <w:t xml:space="preserve">. IPD meta-analysis preserves participant-level covariates and can increase power for treatment-covariate interactions </w:t>
+        <w:t xml:space="preserve">. Individual participant data (IPD) meta-analysis preserves participant-level covariates and can increase power for treatment-covariate interactions </w:t>
       </w:r>
       <w:r>
         <w:rPr>
@@ -312,7 +312,7 @@
     </w:p>
     <w:p>
       <w:r>
-        <w:t>Quantify ATE bias reduction from fixed-effect and DerSimonian-Laird random-effects synthesis of stratum-specific risk differences; compare outcome-informed IONE methods with outcome-free and established comparators; assess the diagnostic discrimination of C1 and W against an empirical null; and identify data-generating conditions under which the diagnostics are most and least informative.</w:t>
+        <w:t>Quantify average treatment effect (ATE) bias reduction from fixed-effect and DerSimonian-Laird random-effects synthesis of stratum-specific risk differences; compare outcome-informed IONE methods with outcome-free and established comparators; assess the diagnostic discrimination of C1 and W against an empirical null; and identify data-generating conditions under which the diagnostics are most and least informative.</w:t>
       </w:r>
     </w:p>
     <w:p>
@@ -597,7 +597,7 @@
         <w:t xml:space="preserve">:</w:t>
       </w:r>
       <w:r>
-        <w:t xml:space="preserve"> proportion of total CATE variance explained by the stratification, i.e. the between-stratum CATE variance divided by the overall CATE variance. </w:t>
+        <w:t xml:space="preserve"> proportion of total conditional average treatment effect (CATE) variance explained by the stratification, i.e. the between-stratum CATE variance divided by the overall CATE variance. </w:t>
       </w:r>
       <m:oMath>
         <m:sSub>
@@ -858,7 +858,7 @@
         <w:t>14</w:t>
       </w:r>
       <w:r>
-        <w:t xml:space="preserve">. We chose hospitalisation rather than infection counts because the published Table 2 provides age- and vaccination-stratified counts for a severe endpoint where age confounding is pronounced, and because the low event rate (~0.09% in the down-sampled data) creates a stress-test for rare outcomes. Because the published counts cover approximately 6.5 million people, we used a stratified random down-sample of 100,000 records preserving the age- and vaccination-specific hospitalisation rates. In the down-sampled pseudo-IPD, some cells contained very few or zero hospitalisation events; logistic models used for outcome-informed methods were fitted with L2 regularisation, and any degenerate one-class fit was handled by returning the observed mean probability. Pseudo-general variables mimicked proxies of the known confounder and the number of strata K was selected from the set {2, 3, min(</w:t>
+        <w:t xml:space="preserve">. We chose hospitalisation rather than infection counts because the age-vaccination stratification table in the source publication provides age- and vaccination-stratified counts for a severe endpoint where age confounding is pronounced, and because the low event rate (~0.09% in the down-sampled data) creates a stress-test for rare outcomes. Because the published counts cover approximately 6.5 million people, we used a stratified random down-sample of 100,000 records preserving the age- and vaccination-specific hospitalisation rates. In the down-sampled pseudo-IPD, some cells contained very few or zero hospitalisation events; logistic models used for outcome-informed methods were fitted with L2 regularisation, and any degenerate one-class fit was handled by returning the observed mean probability. Pseudo-general variables mimicked proxies of the known confounder and the number of strata K was selected from the set {2, 3, min(</w:t>
       </w:r>
       <m:oMath>
         <m:sSub>
@@ -1038,7 +1038,7 @@
         </m:sSub>
       </m:oMath>
       <w:r>
-        <w:t xml:space="preserve">, reflecting that the estimated CATE captures only part of the true CATE variation. The best ATE bias reduction came from 1B_residual: crude bias 0.01865, stratified bias 0.01345 (relative reduction 0.279) and random-effects bias 0.00816 (relative reduction 0.563). For comparison, random-effects pooling across the true study identifiers (i.e. a study-level meta-analysis) gave an absolute ATE bias of 0.01568 (reduction 0.00296 from crude 0.01865). Pooling strata with DerSimonian-Laird improved over the fixed-effect summary, confirming that stratum-specific effects should be allowed to vary. Null-centred excess diagnostics for the best method were modest (C1_excess 0.054; </w:t>
+        <w:t xml:space="preserve">, reflecting that the estimated CATE captures only part of the true CATE variation. The best ATE bias reduction came from 1B_residual: crude bias 0.01865, stratified bias 0.01345 (relative reduction 0.279) and random-effects bias 0.00816 (relative reduction 0.563). For comparison, random-effects pooling across the true study identifiers (i.e. a study-level meta-analysis) gave an absolute ATE bias of 0.01568 (reduction 0.00296 from crude 0.01865). Pooling strata with DerSimonian-Laird improved over the fixed-effect summary, indicating that stratum-specific effects should be allowed to vary. Null-centred excess diagnostics for the best method were modest (C1_excess 0.054; </w:t>
       </w:r>
       <m:oMath>
         <m:sSub>
@@ -3213,7 +3213,7 @@
     </w:p>
     <w:p>
       <w:r>
-        <w:t>Figure 4 and Supplementary Table S2 report n = 500, 2000 and 10 000 (K=5). Crude bias declined with n. The residual method's absolute random-effects ATE bias plateaued near 0.008–0.009 across the three sample sizes (0.00824 at n=500, 0.00852 at n=2000 and 0.00864 at n=10 000), so its relative reduction fell as the crude marginal estimate became more precise. Propensity-score, prognostic-score and clustering-based methods achieved larger relative reductions at n=10 000 (range 0.533–0.669), confirming that performance depends on the method as well as sample size. This pattern indicates that stratification can remove the estimable part of confounding-driven aggregation bias, but it cannot fully adjust for unmodelled hidden effect modification.</w:t>
+        <w:t>Figure 4 and Supplementary Table S2 report n = 500, 2000 and 10 000 (K=5). Crude bias declined with n. The residual method's absolute random-effects ATE bias plateaued near 0.008–0.009 across the three sample sizes (0.00824 at n=500, 0.00852 at n=2000 and 0.00864 at n=10 000), so its relative reduction fell as the crude marginal estimate became more precise. Propensity-score, prognostic-score and clustering-based methods achieved larger relative reductions at n=10 000 (range 0.533–0.669), showing that performance depends on the method as well as sample size. This pattern indicates that stratification can remove the estimable part of confounding-driven aggregation bias, but it cannot fully adjust for unmodelled hidden effect modification.</w:t>
       </w:r>
     </w:p>
     <w:p>
@@ -4039,7 +4039,7 @@
         </m:sSub>
       </m:oMath>
       <w:r>
-        <w:t xml:space="preserve"> TPR 0.020–0.080. These values show that the diagnostics did not reliably distinguish the alternative DGM from the null in the primary scenario; the C1 AUCs at or below 0.5 for several methods confirm that the lower-tail null threshold does not match the direction of the alternative DGM shift for those methods. A main-effects-only outcome model for </w:t>
+        <w:t xml:space="preserve"> TPR 0.020–0.080. These values show that the diagnostics did not reliably distinguish the alternative DGM from the null in the primary scenario; the C1 AUCs at or below 0.5 for several methods show that the lower-tail null threshold does not match the direction of the alternative DGM shift for those methods. Supplementary Table S7 reports absolute-deviation scores using distance from the empirical null mean (e.g. residual C1 abs-AUC 0.473); these did not rescue discrimination, indicating that the weak ROC performance is structural rather than an artifact of the one-sided lower-tail threshold. A main-effects-only outcome model for </w:t>
       </w:r>
       <m:oMath>
         <m:sSub>
@@ -4940,7 +4940,7 @@
         </m:sSub>
       </m:oMath>
       <w:r>
-        <w:t xml:space="preserve"> confirms that the residual and predicted-probability models capture only part of the true CATE variation.</w:t>
+        <w:t xml:space="preserve"> shows that the residual and predicted-probability models capture only part of the true CATE variation.</w:t>
       </w:r>
     </w:p>
     <w:p>
@@ -5487,7 +5487,7 @@
     </w:p>
     <w:p>
       <w:r>
-        <w:t>IONE (Incoherence-Oriented Neutralisation and Extraction) is a descriptive sensitivity framework for hidden effect modification in IPD meta-analysis. Monte Carlo simulation and semi-synthetic examples show that the C1 and W diagnostics can flag incoherence, but they do not reliably separate the alternative data-generating mechanism from an empirical null in the primary scenario. When hidden variables leave strong traces in measured covariates, stratification can partially reduce ATE bias, but separating the data into the true hidden subgroups remains difficult. The diagnostics should be reported alongside conventional meta-analytic models and covariate adjustment, and should not be used as a replacement for rigorous causal inference. We recommend that coherence assessment using C1 and W be considered as a standard sensitivity step in IPD meta-analysis reporting.</w:t>
+        <w:t>IONE (Incoherence-Oriented Neutralisation and Extraction) is a descriptive sensitivity framework for hidden effect modification in IPD meta-analysis. Monte Carlo simulation and semi-synthetic examples show that the C1 and W diagnostics can flag incoherence, but they do not reliably separate the alternative data-generating mechanism from an empirical null in the primary scenario. When hidden variables leave strong traces in measured covariates, stratification can partially reduce ATE bias, but separating the data into the true hidden subgroups remains difficult. Conventional meta-analytic models and covariate adjustment should remain the primary analysis; C1 and W should be reported alongside them as sensitivity checks. Two concrete recommendations follow: (1) use C1 and W only as descriptive flags, not as inferential tests for hidden effect modification, and (2) pre-specify potential effect modifiers and reserve data-driven stratification for exploratory sensitivity analyses, not for decision-making.</w:t>
       </w:r>
     </w:p>
     <w:p>

</xml_diff>

<commit_message>
Define IPD, CATE, DGM at first use; trim abstract to 200 words for SMMR
Co-Authored-By: Tatsuki Onishi <bougtoir@gmail.com>
</commit_message>
<xml_diff>
--- a/results/manuscript/smmr_submission/IONE_smmr_v1.docx
+++ b/results/manuscript/smmr_submission/IONE_smmr_v1.docx
@@ -33,7 +33,7 @@
         <w:t>Background:</w:t>
       </w:r>
       <w:r>
-        <w:t xml:space="preserve"> In IPD meta-analysis, marginal treatment-effect estimates can be biased by hidden effect modifiers. We introduce coherence diagnostics C1 and W and evaluate them in a simulation benchmark of stratification approaches.</w:t>
+        <w:t xml:space="preserve"> In individual participant data (IPD) meta-analysis, marginal effect estimates can be biased by hidden effect modifiers. We introduce coherence diagnostics C1 and W and evaluate them in a simulation benchmark of stratification approaches.</w:t>
       </w:r>
     </w:p>
     <w:p>
@@ -45,7 +45,7 @@
         <w:t>Methods:</w:t>
       </w:r>
       <w:r>
-        <w:t xml:space="preserve"> We simulated an IPD meta-analysis with 10 studies, a binary treatment and outcome, measured covariates carrying traces of an unmeasured modifier, and study-level variation in baseline risk and treatment prevalence. Methods stratified pooled IPD and synthesised stratum-specific risk differences with fixed-effect and DerSimonian-Laird random-effects meta-analysis. We report ARI, C1, W and ATE bias reduction, calibrating C1 and W against their empirical null distributions.</w:t>
+        <w:t xml:space="preserve"> We simulated an IPD meta-analysis with 10 studies, binary treatment and outcome, measured covariates carrying traces of an unmeasured modifier, and study-level variation in baseline risk and treatment prevalence. Methods stratified pooled IPD and synthesised stratum-specific risk differences with fixed-effect and DerSimonian-Laird random-effects meta-analysis. We report ARI, C1, W and ATE bias reduction, calibrating C1 and W against empirical null distributions.</w:t>
       </w:r>
     </w:p>
     <w:p>
@@ -277,7 +277,7 @@
         <w:t>5</w:t>
       </w:r>
       <w:r>
-        <w:t xml:space="preserve"> applied to stratum-specific log odds ratios, and W, the proportion of total CATE variance explained by the stratification. Stratum-specific risk differences are synthesised with fixed-effect or DerSimonian-Laird random-effects meta-analysis. C1 measures the coherence of a stratification after it has been formed; W is a ratio whose denominator is the overall CATE variance and is therefore unstable when the modification signal is weak.</w:t>
+        <w:t xml:space="preserve"> applied to stratum-specific log odds ratios, and W, the proportion of total conditional average treatment effect (CATE) variance explained by the stratification. Stratum-specific risk differences are synthesised with fixed-effect or DerSimonian-Laird random-effects meta-analysis. C1 measures the coherence of a stratification after it has been formed; W is a ratio whose denominator is the overall CATE variance and is therefore unstable when the modification signal is weak.</w:t>
       </w:r>
     </w:p>
     <w:p>
@@ -639,7 +639,7 @@
     </w:p>
     <w:p>
       <w:r>
-        <w:t xml:space="preserve">We ran 200 additional replications under the primary DGM with Z-by-A interaction coefficients set to zero. This retains confounding and covariate traces but has no true effect modification. For each method we recorded C1 and </w:t>
+        <w:t xml:space="preserve">We ran 200 additional replications under the primary data-generating mechanism (DGM) with Z-by-A interaction coefficients set to zero. This retains confounding and covariate traces but has no true effect modification. For each method we recorded C1 and </w:t>
       </w:r>
       <m:oMath>
         <m:sSub>

</xml_diff>

<commit_message>
regenerate SMMR v1 submission package after supplementary citation fix
Co-Authored-By: Tatsuki Onishi <bougtoir@gmail.com>
</commit_message>
<xml_diff>
--- a/results/manuscript/smmr_submission/IONE_smmr_v1.docx
+++ b/results/manuscript/smmr_submission/IONE_smmr_v1.docx
@@ -656,7 +656,7 @@
         </m:sSub>
       </m:oMath>
       <w:r>
-        <w:t xml:space="preserve"> and report the 5th, 50th and 95th percentiles in Supplementary Table S5. Values below the 5th percentile (C1) or above the 95th percentile (</w:t>
+        <w:t xml:space="preserve"> and report the 5th, 50th and 95th percentiles in the Supplementary Material. Values below the 5th percentile (C1) or above the 95th percentile (</w:t>
       </w:r>
       <m:oMath>
         <m:sSub>
@@ -756,7 +756,7 @@
         </m:r>
       </m:oMath>
       <w:r>
-        <w:t xml:space="preserve">, default), and linear plus quadratic interactions. Results are in Supplementary Table S6.</w:t>
+        <w:t xml:space="preserve">, default), and linear plus quadratic interactions. Results are reported in the Supplementary Material.</w:t>
       </w:r>
     </w:p>
     <w:p>
@@ -4039,7 +4039,7 @@
         </m:sSub>
       </m:oMath>
       <w:r>
-        <w:t xml:space="preserve"> TPR 0.020–0.080. These values show that the diagnostics did not reliably distinguish the alternative DGM from the null in the primary scenario; the C1 AUCs at or below 0.5 for several methods show that the lower-tail null threshold does not match the direction of the alternative DGM shift for those methods. Supplementary Table S7 reports absolute-deviation scores using distance from the empirical null mean (e.g. residual C1 abs-AUC 0.473); these did not rescue discrimination, indicating that the weak ROC performance is structural rather than an artifact of the one-sided lower-tail threshold. A main-effects-only outcome model for </w:t>
+        <w:t xml:space="preserve"> TPR 0.020–0.080. These values show that the diagnostics did not reliably distinguish the alternative DGM from the null in the primary scenario; the C1 AUCs at or below 0.5 for several methods show that the lower-tail null threshold does not match the direction of the alternative DGM shift for those methods. Supplementary Table S5 reports the empirical null percentiles used as thresholds. A main-effects-only outcome model for </w:t>
       </w:r>
       <m:oMath>
         <m:sSub>
@@ -4073,7 +4073,7 @@
         </m:sSub>
       </m:oMath>
       <w:r>
-        <w:t xml:space="preserve"> from 0.077 (default interactions) to 0.691, whereas the polynomial interaction model gave 0.046; full results are in Supplementary Table S6. Supplementary Table S5 reports the empirical null percentiles used as thresholds.</w:t>
+        <w:t xml:space="preserve"> from 0.077 (default interactions) to 0.691, whereas the polynomial interaction model gave 0.046; full results are in Supplementary Table S6. Supplementary Table S7 reports absolute-deviation scores using distance from the empirical null mean (e.g. residual C1 abs-AUC 0.473); these did not rescue discrimination, indicating that the weak ROC performance is structural rather than an artifact of the one-sided lower-tail threshold.</w:t>
       </w:r>
     </w:p>
     <w:tbl>

</xml_diff>